<commit_message>
docs(phase-17): Home & My Day closed — full doc, live measurements (LCP -39%), 5/5 e2e + plan marks round 2 (phases 16+17 ☑)
- docs/phase-17/HOME_MY_DAY.md: implementation record, before/after production
  measurements (LCP 1364→828ms), 5-source timeline, gate evidence
- PLAN_STATUS: phase 17 closed (session 9 / Task 41), next = phase 18
- Master plan docx+pdf: round-2 marks — phase 17 (11 items) + heading closed;
  total 23 ☑ (16: 9 · 17: 11 · 23: 2 · 30: 1) + legend, VLM-verified, 24p Amiri
</commit_message>
<xml_diff>
--- a/docs/Awj_Master_Development_Launch_Plan_AR.docx
+++ b/docs/Awj_Master_Development_Launch_Plan_AR.docx
@@ -41,7 +41,7 @@
           <w:rFonts w:ascii="Amiri" w:hAnsi="Amiri" w:cs="Amiri"/>
           <w:sz w:val="22"/>
         </w:rPr>
-        <w:t>نسخة تنفيذية عملية — سبتمبر 2026 · تعليم الحالة في هذه النسخة: ☑ منفَّذ ومتحقَّق منه · ☐ لم يُنفَّذ بعد (آخر تحديث للتعليم: 2026-09-15 — المرحلة 16 مغلقة)</w:t>
+        <w:t>نسخة تنفيذية عملية — سبتمبر 2026 · تعليم الحالة في هذه النسخة: ☑ منفَّذ ومتحقَّق منه · ☐ لم يُنفَّذ بعد (آخر تحديث للتعليم: 2026-09-15 — المرحلتان 16 و17 مغلقتان)</w:t>
       </w:r>
     </w:p>
     <w:tbl>
@@ -2910,7 +2910,7 @@
           <w:color w:val="1D4ED8"/>
           <w:sz w:val="36"/>
         </w:rPr>
-        <w:t>المرحلة 17 — Home + My Day</w:t>
+        <w:t>المرحلة 17 — Home + My Day — مغلقة ✓</w:t>
       </w:r>
     </w:p>
     <w:p>
@@ -2971,7 +2971,7 @@
           <w:rFonts w:ascii="Amiri" w:hAnsi="Amiri" w:cs="Amiri"/>
           <w:sz w:val="19"/>
         </w:rPr>
-        <w:t>☐ إعادة بناء Home hierarchy: Greeting → Focus of the Day → Today snapshot → Continue → Quick actions → Progress → Discover.</w:t>
+        <w:t>☑ إعادة بناء Home hierarchy: Greeting → Focus of the Day → Today snapshot → Continue → Quick actions → Progress → Discover.</w:t>
       </w:r>
     </w:p>
     <w:p>
@@ -2986,7 +2986,7 @@
           <w:rFonts w:ascii="Amiri" w:hAnsi="Amiri" w:cs="Amiri"/>
           <w:sz w:val="19"/>
         </w:rPr>
-        <w:t>☐ إنشاء “My Day timeline” تجمع task/habit/focus/routine/planner items حسب الوقت.</w:t>
+        <w:t>☑ إنشاء “My Day timeline” تجمع task/habit/focus/routine/planner items حسب الوقت.</w:t>
       </w:r>
     </w:p>
     <w:p>
@@ -3001,7 +3001,7 @@
           <w:rFonts w:ascii="Amiri" w:hAnsi="Amiri" w:cs="Amiri"/>
           <w:sz w:val="19"/>
         </w:rPr>
-        <w:t>☐ إضافة Quick Add عبر bottom sheet على الهاتف وcommand/popover على سطح المكتب.</w:t>
+        <w:t>☑ إضافة Quick Add عبر bottom sheet على الهاتف وcommand/popover على سطح المكتب.</w:t>
       </w:r>
     </w:p>
     <w:p>
@@ -3016,7 +3016,7 @@
           <w:rFonts w:ascii="Amiri" w:hAnsi="Amiri" w:cs="Amiri"/>
           <w:sz w:val="19"/>
         </w:rPr>
-        <w:t>☐ إضافة Continue where you left off من التعلم/القراءة/المشروع.</w:t>
+        <w:t>☑ إضافة Continue where you left off من التعلم/القراءة/المشروع.</w:t>
       </w:r>
     </w:p>
     <w:p>
@@ -3031,7 +3031,7 @@
           <w:rFonts w:ascii="Amiri" w:hAnsi="Amiri" w:cs="Amiri"/>
           <w:sz w:val="19"/>
         </w:rPr>
-        <w:t>☐ حصر التحميل الأولي على البيانات المطلوبة فوق fold؛ أي شيء ثانوي lazy.</w:t>
+        <w:t>☑ حصر التحميل الأولي على البيانات المطلوبة فوق fold؛ أي شيء ثانوي lazy.</w:t>
       </w:r>
     </w:p>
     <w:p>
@@ -3046,7 +3046,7 @@
           <w:rFonts w:ascii="Amiri" w:hAnsi="Amiri" w:cs="Amiri"/>
           <w:sz w:val="19"/>
         </w:rPr>
-        <w:t>☐ بناء حالات user state: جديد، يوم فارغ، يوم مزدحم، مساء، مستخدم تعلم-focused.</w:t>
+        <w:t>☑ بناء حالات user state: جديد، يوم فارغ، يوم مزدحم، مساء، مستخدم تعلم-focused.</w:t>
       </w:r>
     </w:p>
     <w:p>
@@ -3061,7 +3061,7 @@
           <w:rFonts w:ascii="Amiri" w:hAnsi="Amiri" w:cs="Amiri"/>
           <w:sz w:val="19"/>
         </w:rPr>
-        <w:t>☐ منع guilt copy: لا “فشلت” ولا red overload؛ استخدام “المتبقي” و“الفرصة التالية”.</w:t>
+        <w:t>☑ منع guilt copy: لا “فشلت” ولا red overload؛ استخدام “المتبقي” و“الفرصة التالية”.</w:t>
       </w:r>
     </w:p>
     <w:p>
@@ -3092,7 +3092,7 @@
           <w:rFonts w:ascii="Amiri" w:hAnsi="Amiri" w:cs="Amiri"/>
           <w:sz w:val="19"/>
         </w:rPr>
-        <w:t>☐ Playwright: Home loads for new/returning user.</w:t>
+        <w:t>☑ Playwright: Home loads for new/returning user.</w:t>
       </w:r>
     </w:p>
     <w:p>
@@ -3107,7 +3107,7 @@
           <w:rFonts w:ascii="Amiri" w:hAnsi="Amiri" w:cs="Amiri"/>
           <w:sz w:val="19"/>
         </w:rPr>
-        <w:t>☐ Playwright: Quick Add creates one entity without duplicate request.</w:t>
+        <w:t>☑ Playwright: Quick Add creates one entity without duplicate request.</w:t>
       </w:r>
     </w:p>
     <w:p>
@@ -3122,7 +3122,7 @@
           <w:rFonts w:ascii="Amiri" w:hAnsi="Amiri" w:cs="Amiri"/>
           <w:sz w:val="19"/>
         </w:rPr>
-        <w:t>☐ Visual regression للـHome mobile/desktop.</w:t>
+        <w:t>☑ Visual regression للـHome mobile/desktop.</w:t>
       </w:r>
     </w:p>
     <w:p>
@@ -3137,7 +3137,7 @@
           <w:rFonts w:ascii="Amiri" w:hAnsi="Amiri" w:cs="Amiri"/>
           <w:sz w:val="19"/>
         </w:rPr>
-        <w:t>☐ قياس LCP وTTFB وطلبات أول render قبل/بعد.</w:t>
+        <w:t>☑ قياس LCP وTTFB وطلبات أول render قبل/بعد.</w:t>
       </w:r>
     </w:p>
     <w:tbl>

</xml_diff>

<commit_message>
docs(plan): mark phase-18 tasks ☑ in the master plan (9 items + heading closed) — 33 ☑ total, 16/17/18 closed
</commit_message>
<xml_diff>
--- a/docs/Awj_Master_Development_Launch_Plan_AR.docx
+++ b/docs/Awj_Master_Development_Launch_Plan_AR.docx
@@ -41,7 +41,7 @@
           <w:rFonts w:ascii="Amiri" w:hAnsi="Amiri" w:cs="Amiri"/>
           <w:sz w:val="22"/>
         </w:rPr>
-        <w:t>نسخة تنفيذية عملية — سبتمبر 2026 · تعليم الحالة في هذه النسخة: ☑ منفَّذ ومتحقَّق منه · ☐ لم يُنفَّذ بعد (آخر تحديث للتعليم: 2026-09-15 — المرحلتان 16 و17 مغلقتان)</w:t>
+        <w:t>نسخة تنفيذية عملية — سبتمبر 2026 · تعليم الحالة في هذه النسخة: ☑ منفَّذ ومتحقَّق منه · ☐ لم يُنفَّذ بعد (آخر تحديث للتعليم: 2026-09-15 — المراحل 16 و17 و18 مغلقة)</w:t>
       </w:r>
     </w:p>
     <w:tbl>
@@ -3199,7 +3199,7 @@
           <w:color w:val="1D4ED8"/>
           <w:sz w:val="36"/>
         </w:rPr>
-        <w:t>المرحلة 18 — Navigation + Explore</w:t>
+        <w:t>المرحلة 18 — Navigation + Explore — مغلقة ✓</w:t>
       </w:r>
     </w:p>
     <w:p>
@@ -3260,7 +3260,7 @@
           <w:rFonts w:ascii="Amiri" w:hAnsi="Amiri" w:cs="Amiri"/>
           <w:sz w:val="19"/>
         </w:rPr>
-        <w:t>☐ تحويل Sidebar إلى grouped worlds مع section labels واضحة.</w:t>
+        <w:t>☑ تحويل Sidebar إلى grouped worlds مع section labels واضحة.</w:t>
       </w:r>
     </w:p>
     <w:p>
@@ -3275,7 +3275,7 @@
           <w:rFonts w:ascii="Amiri" w:hAnsi="Amiri" w:cs="Amiri"/>
           <w:sz w:val="19"/>
         </w:rPr>
-        <w:t>☐ إنشاء Explore Hub يعرض العوالم بدل شبكة 20+ module.</w:t>
+        <w:t>☑ إنشاء Explore Hub يعرض العوالم بدل شبكة 20+ module.</w:t>
       </w:r>
     </w:p>
     <w:p>
@@ -3290,7 +3290,7 @@
           <w:rFonts w:ascii="Amiri" w:hAnsi="Amiri" w:cs="Amiri"/>
           <w:sz w:val="19"/>
         </w:rPr>
-        <w:t>☐ إضافة search/command يفتح أي وحدة مباشرة بدون جعل القائمة الأساسية طويلة.</w:t>
+        <w:t>☑ إضافة search/command يفتح أي وحدة مباشرة بدون جعل القائمة الأساسية طويلة.</w:t>
       </w:r>
     </w:p>
     <w:p>
@@ -3305,7 +3305,7 @@
           <w:rFonts w:ascii="Amiri" w:hAnsi="Amiri" w:cs="Amiri"/>
           <w:sz w:val="19"/>
         </w:rPr>
-        <w:t>☐ تثبيت حالات active/back/breadcrumb للموبايل.</w:t>
+        <w:t>☑ تثبيت حالات active/back/breadcrumb للموبايل.</w:t>
       </w:r>
     </w:p>
     <w:p>
@@ -3320,7 +3320,7 @@
           <w:rFonts w:ascii="Amiri" w:hAnsi="Amiri" w:cs="Amiri"/>
           <w:sz w:val="19"/>
         </w:rPr>
-        <w:t>☐ إخفاء العناصر غير الأساسية داخل “المزيد”.</w:t>
+        <w:t>☑ إخفاء العناصر غير الأساسية داخل “المزيد”.</w:t>
       </w:r>
     </w:p>
     <w:p>
@@ -3335,7 +3335,7 @@
           <w:rFonts w:ascii="Amiri" w:hAnsi="Amiri" w:cs="Amiri"/>
           <w:sz w:val="19"/>
         </w:rPr>
-        <w:t>☐ توحيد اسماء الوحدات بين nav، routes، page titles، analytics events.</w:t>
+        <w:t>☑ توحيد اسماء الوحدات بين nav، routes، page titles، analytics events.</w:t>
       </w:r>
     </w:p>
     <w:p>
@@ -3366,7 +3366,7 @@
           <w:rFonts w:ascii="Amiri" w:hAnsi="Amiri" w:cs="Amiri"/>
           <w:sz w:val="19"/>
         </w:rPr>
-        <w:t>☐ Test كل route direct load + refresh + back/forward.</w:t>
+        <w:t>☑ Test كل route direct load + refresh + back/forward.</w:t>
       </w:r>
     </w:p>
     <w:p>
@@ -3381,7 +3381,7 @@
           <w:rFonts w:ascii="Amiri" w:hAnsi="Amiri" w:cs="Amiri"/>
           <w:sz w:val="19"/>
         </w:rPr>
-        <w:t>☐ Test keyboard navigation للـSidebar/Explore/Command.</w:t>
+        <w:t>☑ Test keyboard navigation للـSidebar/Explore/Command.</w:t>
       </w:r>
     </w:p>
     <w:p>
@@ -3396,7 +3396,7 @@
           <w:rFonts w:ascii="Amiri" w:hAnsi="Amiri" w:cs="Amiri"/>
           <w:sz w:val="19"/>
         </w:rPr>
-        <w:t>☐ Test RTL/desktop/mobile.</w:t>
+        <w:t>☑ Test RTL/desktop/mobile.</w:t>
       </w:r>
     </w:p>
     <w:tbl>

</xml_diff>

<commit_message>
docs(plan): mark phase-19 tasks ☑ in the master plan (15 items + heading closed) — 48 ☑ total, 16/17/18/19 closed
</commit_message>
<xml_diff>
--- a/docs/Awj_Master_Development_Launch_Plan_AR.docx
+++ b/docs/Awj_Master_Development_Launch_Plan_AR.docx
@@ -41,7 +41,7 @@
           <w:rFonts w:ascii="Amiri" w:hAnsi="Amiri" w:cs="Amiri"/>
           <w:sz w:val="22"/>
         </w:rPr>
-        <w:t>نسخة تنفيذية عملية — سبتمبر 2026 · تعليم الحالة في هذه النسخة: ☑ منفَّذ ومتحقَّق منه · ☐ لم يُنفَّذ بعد (آخر تحديث للتعليم: 2026-09-15 — المراحل 16 و17 و18 مغلقة)</w:t>
+        <w:t>نسخة تنفيذية عملية — سبتمبر 2026 · تعليم الحالة في هذه النسخة: ☑ منفَّذ ومتحقَّق منه · ☐ لم يُنفَّذ بعد (آخر تحديث للتعليم: 2026-09-15 — المراحل 16 و17 و18 و19 مغلقة)</w:t>
       </w:r>
     </w:p>
     <w:tbl>
@@ -3458,7 +3458,7 @@
           <w:color w:val="1D4ED8"/>
           <w:sz w:val="36"/>
         </w:rPr>
-        <w:t>المرحلة 19 — إعادة تشكيل الوحدات الأساسية</w:t>
+        <w:t>المرحلة 19 — إعادة تشكيل الوحدات الأساسية — مغلقة ✓</w:t>
       </w:r>
     </w:p>
     <w:p>
@@ -3519,7 +3519,7 @@
           <w:rFonts w:ascii="Amiri" w:hAnsi="Amiri" w:cs="Amiri"/>
           <w:sz w:val="19"/>
         </w:rPr>
-        <w:t>☐ Tasks: list/timeline + priorities + Today.</w:t>
+        <w:t>☑ Tasks: list/timeline + priorities + Today.</w:t>
       </w:r>
     </w:p>
     <w:p>
@@ -3534,7 +3534,7 @@
           <w:rFonts w:ascii="Amiri" w:hAnsi="Amiri" w:cs="Amiri"/>
           <w:sz w:val="19"/>
         </w:rPr>
-        <w:t>☐ Projects: board/cards + progress.</w:t>
+        <w:t>☑ Projects: board/cards + progress.</w:t>
       </w:r>
     </w:p>
     <w:p>
@@ -3549,7 +3549,7 @@
           <w:rFonts w:ascii="Amiri" w:hAnsi="Amiri" w:cs="Amiri"/>
           <w:sz w:val="19"/>
         </w:rPr>
-        <w:t>☐ Goals: progress and milestones.</w:t>
+        <w:t>☑ Goals: progress and milestones.</w:t>
       </w:r>
     </w:p>
     <w:p>
@@ -3564,7 +3564,7 @@
           <w:rFonts w:ascii="Amiri" w:hAnsi="Amiri" w:cs="Amiri"/>
           <w:sz w:val="19"/>
         </w:rPr>
-        <w:t>☐ Habits: calendar/streak rings.</w:t>
+        <w:t>☑ Habits: calendar/streak rings.</w:t>
       </w:r>
     </w:p>
     <w:p>
@@ -3579,7 +3579,7 @@
           <w:rFonts w:ascii="Amiri" w:hAnsi="Amiri" w:cs="Amiri"/>
           <w:sz w:val="19"/>
         </w:rPr>
-        <w:t>☐ Learning: course/resource cards + continue.</w:t>
+        <w:t>☑ Learning: course/resource cards + continue.</w:t>
       </w:r>
     </w:p>
     <w:p>
@@ -3594,7 +3594,7 @@
           <w:rFonts w:ascii="Amiri" w:hAnsi="Amiri" w:cs="Amiri"/>
           <w:sz w:val="19"/>
         </w:rPr>
-        <w:t>☐ Reading: progress/session.</w:t>
+        <w:t>☑ Reading: progress/session.</w:t>
       </w:r>
     </w:p>
     <w:p>
@@ -3609,7 +3609,7 @@
           <w:rFonts w:ascii="Amiri" w:hAnsi="Amiri" w:cs="Amiri"/>
           <w:sz w:val="19"/>
         </w:rPr>
-        <w:t>☐ Deep Work: timer-first immersive screen.</w:t>
+        <w:t>☑ Deep Work: timer-first immersive screen.</w:t>
       </w:r>
     </w:p>
     <w:p>
@@ -3624,7 +3624,7 @@
           <w:rFonts w:ascii="Amiri" w:hAnsi="Amiri" w:cs="Amiri"/>
           <w:sz w:val="19"/>
         </w:rPr>
-        <w:t>☐ Journal: writing-first بدون distractions.</w:t>
+        <w:t>☑ Journal: writing-first بدون distractions.</w:t>
       </w:r>
     </w:p>
     <w:p>
@@ -3639,7 +3639,7 @@
           <w:rFonts w:ascii="Amiri" w:hAnsi="Amiri" w:cs="Amiri"/>
           <w:sz w:val="19"/>
         </w:rPr>
-        <w:t>☐ Health/Finance: privacy-sensitive layouts، لا Ads داخل الإدخال.</w:t>
+        <w:t>☑ Health/Finance: privacy-sensitive layouts، لا Ads داخل الإدخال.</w:t>
       </w:r>
     </w:p>
     <w:p>
@@ -3654,7 +3654,7 @@
           <w:rFonts w:ascii="Amiri" w:hAnsi="Amiri" w:cs="Amiri"/>
           <w:sz w:val="19"/>
         </w:rPr>
-        <w:t>☐ Calendar: unified view من مصادر البيانات بدون duplicate data source.</w:t>
+        <w:t>☑ Calendar: unified view من مصادر البيانات بدون duplicate data source.</w:t>
       </w:r>
     </w:p>
     <w:p>
@@ -3669,7 +3669,7 @@
           <w:rFonts w:ascii="Amiri" w:hAnsi="Amiri" w:cs="Amiri"/>
           <w:sz w:val="19"/>
         </w:rPr>
-        <w:t>☐ Analytics: charts تبدأ من aggregation وليس تنزيل records الخام.</w:t>
+        <w:t>☑ Analytics: charts تبدأ من aggregation وليس تنزيل records الخام.</w:t>
       </w:r>
     </w:p>
     <w:p>
@@ -3700,7 +3700,7 @@
           <w:rFonts w:ascii="Amiri" w:hAnsi="Amiri" w:cs="Amiri"/>
           <w:sz w:val="19"/>
         </w:rPr>
-        <w:t>☐ Per-module CRUD regression.</w:t>
+        <w:t>☑ Per-module CRUD regression.</w:t>
       </w:r>
     </w:p>
     <w:p>
@@ -3715,7 +3715,7 @@
           <w:rFonts w:ascii="Amiri" w:hAnsi="Amiri" w:cs="Amiri"/>
           <w:sz w:val="19"/>
         </w:rPr>
-        <w:t>☐ Idempotency regression لكل mutation.</w:t>
+        <w:t>☑ Idempotency regression لكل mutation.</w:t>
       </w:r>
     </w:p>
     <w:p>
@@ -3730,7 +3730,7 @@
           <w:rFonts w:ascii="Amiri" w:hAnsi="Amiri" w:cs="Amiri"/>
           <w:sz w:val="19"/>
         </w:rPr>
-        <w:t>☐ Error/empty/offline states.</w:t>
+        <w:t>☑ Error/empty/offline states.</w:t>
       </w:r>
     </w:p>
     <w:p>
@@ -3745,7 +3745,7 @@
           <w:rFonts w:ascii="Amiri" w:hAnsi="Amiri" w:cs="Amiri"/>
           <w:sz w:val="19"/>
         </w:rPr>
-        <w:t>☐ Performance smoke على أكبر lists.</w:t>
+        <w:t>☑ Performance smoke على أكبر lists.</w:t>
       </w:r>
     </w:p>
     <w:tbl>

</xml_diff>

<commit_message>
docs: phase-20 closure — AUTH_CONSENT.md + PLAN_STATUS + SECURITY_PRIVACY providers/storage audit + worklog Task 47 + plan marks (13 ☑ + heading — 61 ☑ total, 16-20 closed)
</commit_message>
<xml_diff>
--- a/docs/Awj_Master_Development_Launch_Plan_AR.docx
+++ b/docs/Awj_Master_Development_Launch_Plan_AR.docx
@@ -3807,7 +3807,7 @@
           <w:color w:val="1D4ED8"/>
           <w:sz w:val="36"/>
         </w:rPr>
-        <w:t>المرحلة 20 — Onboarding + Auth + Consent</w:t>
+        <w:t>المرحلة 20 — Onboarding + Auth + Consent — مغلقة ✓</w:t>
       </w:r>
     </w:p>
     <w:p>
@@ -3868,7 +3868,7 @@
           <w:rFonts w:ascii="Amiri" w:hAnsi="Amiri" w:cs="Amiri"/>
           <w:sz w:val="19"/>
         </w:rPr>
-        <w:t>☐ إضافة مسارات واضحة /login و/signup إن لم تُثبت تجربة query-mode الأفضل، مع الحفاظ على backward compatibility.</w:t>
+        <w:t>☑ إضافة مسارات واضحة /login و/signup إن لم تُثبت تجربة query-mode الأفضل، مع الحفاظ على backward compatibility.</w:t>
       </w:r>
     </w:p>
     <w:p>
@@ -3883,7 +3883,7 @@
           <w:rFonts w:ascii="Amiri" w:hAnsi="Amiri" w:cs="Amiri"/>
           <w:sz w:val="19"/>
         </w:rPr>
-        <w:t>☐ إضافة Terms + Privacy checkbox إلزامي في signup مع روابط واضحة.</w:t>
+        <w:t>☑ إضافة Terms + Privacy checkbox إلزامي في signup مع روابط واضحة.</w:t>
       </w:r>
     </w:p>
     <w:p>
@@ -3898,7 +3898,7 @@
           <w:rFonts w:ascii="Amiri" w:hAnsi="Amiri" w:cs="Amiri"/>
           <w:sz w:val="19"/>
         </w:rPr>
-        <w:t>☐ إنشاء user_consents: user_id، consent_type، policy_version، consented_at، minimal metadata.</w:t>
+        <w:t>☑ إنشاء user_consents: user_id، consent_type، policy_version، consented_at، minimal metadata.</w:t>
       </w:r>
     </w:p>
     <w:p>
@@ -3913,7 +3913,7 @@
           <w:rFonts w:ascii="Amiri" w:hAnsi="Amiri" w:cs="Amiri"/>
           <w:sz w:val="19"/>
         </w:rPr>
-        <w:t>☐ رفض التسجيل خادميًا إذا لم يتم قبول النسخة المطلوبة.</w:t>
+        <w:t>☑ رفض التسجيل خادميًا إذا لم يتم قبول النسخة المطلوبة.</w:t>
       </w:r>
     </w:p>
     <w:p>
@@ -3928,7 +3928,7 @@
           <w:rFonts w:ascii="Amiri" w:hAnsi="Amiri" w:cs="Amiri"/>
           <w:sz w:val="19"/>
         </w:rPr>
-        <w:t>☐ إظهار password requirements indicator بشكل واضح.</w:t>
+        <w:t>☑ إظهار password requirements indicator بشكل واضح.</w:t>
       </w:r>
     </w:p>
     <w:p>
@@ -3943,7 +3943,7 @@
           <w:rFonts w:ascii="Amiri" w:hAnsi="Amiri" w:cs="Amiri"/>
           <w:sz w:val="19"/>
         </w:rPr>
-        <w:t>☐ معالجة email confirmation/resend/reset-password بحالات UX واضحة.</w:t>
+        <w:t>☑ معالجة email confirmation/resend/reset-password بحالات UX واضحة.</w:t>
       </w:r>
     </w:p>
     <w:p>
@@ -3958,7 +3958,7 @@
           <w:rFonts w:ascii="Amiri" w:hAnsi="Amiri" w:cs="Amiri"/>
           <w:sz w:val="19"/>
         </w:rPr>
-        <w:t>☐ تأكيد عدم وضع session/token في localStorage.</w:t>
+        <w:t>☑ تأكيد عدم وضع session/token في localStorage.</w:t>
       </w:r>
     </w:p>
     <w:p>
@@ -3973,7 +3973,7 @@
           <w:rFonts w:ascii="Amiri" w:hAnsi="Amiri" w:cs="Amiri"/>
           <w:sz w:val="19"/>
         </w:rPr>
-        <w:t>☐ ضبط logout من كل الأجهزة عند الحالات الحساسة عند الحاجة.</w:t>
+        <w:t>☑ ضبط logout من كل الأجهزة عند الحالات الحساسة عند الحاجة.</w:t>
       </w:r>
     </w:p>
     <w:p>
@@ -3988,7 +3988,7 @@
           <w:rFonts w:ascii="Amiri" w:hAnsi="Amiri" w:cs="Amiri"/>
           <w:sz w:val="19"/>
         </w:rPr>
-        <w:t>☐ تحديث Security/Privacy docs لتطابق providers الحقيقيين.</w:t>
+        <w:t>☑ تحديث Security/Privacy docs لتطابق providers الحقيقيين.</w:t>
       </w:r>
     </w:p>
     <w:p>
@@ -4019,7 +4019,7 @@
           <w:rFonts w:ascii="Amiri" w:hAnsi="Amiri" w:cs="Amiri"/>
           <w:sz w:val="19"/>
         </w:rPr>
-        <w:t>☐ Playwright auth state على حسابات اختبار مع حفظ auth state خارج git.</w:t>
+        <w:t>☑ Playwright auth state على حسابات اختبار مع حفظ auth state خارج git.</w:t>
       </w:r>
     </w:p>
     <w:p>
@@ -4034,7 +4034,7 @@
           <w:rFonts w:ascii="Amiri" w:hAnsi="Amiri" w:cs="Amiri"/>
           <w:sz w:val="19"/>
         </w:rPr>
-        <w:t>☐ 401/403/CSRF/session expiry tests.</w:t>
+        <w:t>☑ 401/403/CSRF/session expiry tests.</w:t>
       </w:r>
     </w:p>
     <w:p>
@@ -4049,7 +4049,7 @@
           <w:rFonts w:ascii="Amiri" w:hAnsi="Amiri" w:cs="Amiri"/>
           <w:sz w:val="19"/>
         </w:rPr>
-        <w:t>☐ Consent acceptance + refusal + policy version update tests.</w:t>
+        <w:t>☑ Consent acceptance + refusal + policy version update tests.</w:t>
       </w:r>
     </w:p>
     <w:p>
@@ -4064,7 +4064,7 @@
           <w:rFonts w:ascii="Amiri" w:hAnsi="Amiri" w:cs="Amiri"/>
           <w:sz w:val="19"/>
         </w:rPr>
-        <w:t>☐ Account deletion/export regression.</w:t>
+        <w:t>☑ Account deletion/export regression.</w:t>
       </w:r>
     </w:p>
     <w:tbl>

</xml_diff>